<commit_message>
updated changes and latest push of the extension
</commit_message>
<xml_diff>
--- a/samples/master-test.docx
+++ b/samples/master-test.docx
@@ -12,18 +12,10 @@
     </w:p>
     <w:p>
       <w:pPr>
-        <w:pStyle w:val="Author"/>
-      </w:pPr>
-      <w:r>
-        <w:t xml:space="preserve">Aryan Singh</w:t>
-      </w:r>
-    </w:p>
-    <w:p>
-      <w:pPr>
         <w:pStyle w:val="Date"/>
       </w:pPr>
       <w:r>
-        <w:t xml:space="preserve">June 12, 2026</w:t>
+        <w:t xml:space="preserve">June 26, 2026</w:t>
       </w:r>
     </w:p>
     <w:bookmarkStart w:id="88" w:name="inkdown-master-test-document"/>
@@ -3058,7 +3050,7 @@
               <a:graphicData uri="http://schemas.openxmlformats.org/drawingml/2006/picture">
                 <pic:pic>
                   <pic:nvPicPr>
-                    <pic:cNvPr descr="/var/folders/jb/21bs3_q12fj3w2_sz4tyt5nm0000gn/T/inkdown-mermaid-95fe5921-e9a6-48a1-bc6f-5af90f719a5d/mermaid-diagram-1.png" id="43" name="Picture"/>
+                    <pic:cNvPr descr="/var/folders/jb/21bs3_q12fj3w2_sz4tyt5nm0000gn/T/inkdown-mermaid-ac59f50d-191a-4958-97d7-d53e3139141c/mermaid-diagram-1.png" id="43" name="Picture"/>
                     <pic:cNvPicPr>
                       <a:picLocks noChangeArrowheads="1" noChangeAspect="1"/>
                     </pic:cNvPicPr>
@@ -3123,7 +3115,7 @@
               <a:graphicData uri="http://schemas.openxmlformats.org/drawingml/2006/picture">
                 <pic:pic>
                   <pic:nvPicPr>
-                    <pic:cNvPr descr="/var/folders/jb/21bs3_q12fj3w2_sz4tyt5nm0000gn/T/inkdown-mermaid-95fe5921-e9a6-48a1-bc6f-5af90f719a5d/mermaid-diagram-2.png" id="47" name="Picture"/>
+                    <pic:cNvPr descr="/var/folders/jb/21bs3_q12fj3w2_sz4tyt5nm0000gn/T/inkdown-mermaid-ac59f50d-191a-4958-97d7-d53e3139141c/mermaid-diagram-2.png" id="47" name="Picture"/>
                     <pic:cNvPicPr>
                       <a:picLocks noChangeArrowheads="1" noChangeAspect="1"/>
                     </pic:cNvPicPr>
@@ -3181,20 +3173,29 @@
       <w:r>
         <w:drawing>
           <wp:inline>
-            <wp:extent cx="5943600" cy="3272108"/>
+            <wp:extent cx="5943600" cy="3246120"/>
             <wp:effectExtent b="0" l="0" r="0" t="0"/>
             <wp:docPr descr="Mermaid Diagram 3" title="" id="50" name="Picture"/>
             <a:graphic>
               <a:graphicData uri="http://schemas.openxmlformats.org/drawingml/2006/picture">
                 <pic:pic>
                   <pic:nvPicPr>
-                    <pic:cNvPr descr="/var/folders/jb/21bs3_q12fj3w2_sz4tyt5nm0000gn/T/inkdown-mermaid-95fe5921-e9a6-48a1-bc6f-5af90f719a5d/mermaid-diagram-3.png" id="51" name="Picture"/>
+                    <pic:cNvPr descr="/var/folders/jb/21bs3_q12fj3w2_sz4tyt5nm0000gn/T/inkdown-mermaid-ac59f50d-191a-4958-97d7-d53e3139141c/mermaid-diagram-3.svg" id="51" name="Picture"/>
                     <pic:cNvPicPr>
                       <a:picLocks noChangeArrowheads="1" noChangeAspect="1"/>
                     </pic:cNvPicPr>
                   </pic:nvPicPr>
                   <pic:blipFill>
-                    <a:blip r:embed="rId49"/>
+                    <a:blip>
+                      <a:extLst>
+                        <a:ext uri="{28A0092B-C50C-407E-A947-70E740481C1C}">
+                          <a14:useLocalDpi xmlns:a14="http://schemas.microsoft.com/office/drawing/2010/main" val="0"/>
+                        </a:ext>
+                        <a:ext uri="{96DAC541-7B7A-43D3-8B79-37D633B846F1}">
+                          <asvg:svgBlip xmlns:asvg="http://schemas.microsoft.com/office/drawing/2016/SVG/main" r:embed="rId49"/>
+                        </a:ext>
+                      </a:extLst>
+                    </a:blip>
                     <a:stretch>
                       <a:fillRect/>
                     </a:stretch>
@@ -3202,7 +3203,7 @@
                   <pic:spPr bwMode="auto">
                     <a:xfrm>
                       <a:off x="0" y="0"/>
-                      <a:ext cx="5943600" cy="3272108"/>
+                      <a:ext cx="5943600" cy="3246120"/>
                     </a:xfrm>
                     <a:prstGeom prst="rect">
                       <a:avLst/>
@@ -3253,7 +3254,7 @@
               <a:graphicData uri="http://schemas.openxmlformats.org/drawingml/2006/picture">
                 <pic:pic>
                   <pic:nvPicPr>
-                    <pic:cNvPr descr="/var/folders/jb/21bs3_q12fj3w2_sz4tyt5nm0000gn/T/inkdown-mermaid-95fe5921-e9a6-48a1-bc6f-5af90f719a5d/mermaid-diagram-4.png" id="55" name="Picture"/>
+                    <pic:cNvPr descr="/var/folders/jb/21bs3_q12fj3w2_sz4tyt5nm0000gn/T/inkdown-mermaid-ac59f50d-191a-4958-97d7-d53e3139141c/mermaid-diagram-4.png" id="55" name="Picture"/>
                     <pic:cNvPicPr>
                       <a:picLocks noChangeArrowheads="1" noChangeAspect="1"/>
                     </pic:cNvPicPr>
@@ -3318,7 +3319,7 @@
               <a:graphicData uri="http://schemas.openxmlformats.org/drawingml/2006/picture">
                 <pic:pic>
                   <pic:nvPicPr>
-                    <pic:cNvPr descr="/var/folders/jb/21bs3_q12fj3w2_sz4tyt5nm0000gn/T/inkdown-mermaid-95fe5921-e9a6-48a1-bc6f-5af90f719a5d/mermaid-diagram-5.png" id="59" name="Picture"/>
+                    <pic:cNvPr descr="/var/folders/jb/21bs3_q12fj3w2_sz4tyt5nm0000gn/T/inkdown-mermaid-ac59f50d-191a-4958-97d7-d53e3139141c/mermaid-diagram-5.png" id="59" name="Picture"/>
                     <pic:cNvPicPr>
                       <a:picLocks noChangeArrowheads="1" noChangeAspect="1"/>
                     </pic:cNvPicPr>
@@ -3383,7 +3384,7 @@
               <a:graphicData uri="http://schemas.openxmlformats.org/drawingml/2006/picture">
                 <pic:pic>
                   <pic:nvPicPr>
-                    <pic:cNvPr descr="/var/folders/jb/21bs3_q12fj3w2_sz4tyt5nm0000gn/T/inkdown-mermaid-95fe5921-e9a6-48a1-bc6f-5af90f719a5d/mermaid-diagram-6.png" id="63" name="Picture"/>
+                    <pic:cNvPr descr="/var/folders/jb/21bs3_q12fj3w2_sz4tyt5nm0000gn/T/inkdown-mermaid-ac59f50d-191a-4958-97d7-d53e3139141c/mermaid-diagram-6.png" id="63" name="Picture"/>
                     <pic:cNvPicPr>
                       <a:picLocks noChangeArrowheads="1" noChangeAspect="1"/>
                     </pic:cNvPicPr>
@@ -3441,20 +3442,29 @@
       <w:r>
         <w:drawing>
           <wp:inline>
-            <wp:extent cx="5943600" cy="1385022"/>
+            <wp:extent cx="5943600" cy="1318398"/>
             <wp:effectExtent b="0" l="0" r="0" t="0"/>
             <wp:docPr descr="Mermaid Diagram 7" title="" id="66" name="Picture"/>
             <a:graphic>
               <a:graphicData uri="http://schemas.openxmlformats.org/drawingml/2006/picture">
                 <pic:pic>
                   <pic:nvPicPr>
-                    <pic:cNvPr descr="/var/folders/jb/21bs3_q12fj3w2_sz4tyt5nm0000gn/T/inkdown-mermaid-95fe5921-e9a6-48a1-bc6f-5af90f719a5d/mermaid-diagram-7.png" id="67" name="Picture"/>
+                    <pic:cNvPr descr="/var/folders/jb/21bs3_q12fj3w2_sz4tyt5nm0000gn/T/inkdown-mermaid-ac59f50d-191a-4958-97d7-d53e3139141c/mermaid-diagram-7.svg" id="67" name="Picture"/>
                     <pic:cNvPicPr>
                       <a:picLocks noChangeArrowheads="1" noChangeAspect="1"/>
                     </pic:cNvPicPr>
                   </pic:nvPicPr>
                   <pic:blipFill>
-                    <a:blip r:embed="rId65"/>
+                    <a:blip>
+                      <a:extLst>
+                        <a:ext uri="{28A0092B-C50C-407E-A947-70E740481C1C}">
+                          <a14:useLocalDpi xmlns:a14="http://schemas.microsoft.com/office/drawing/2010/main" val="0"/>
+                        </a:ext>
+                        <a:ext uri="{96DAC541-7B7A-43D3-8B79-37D633B846F1}">
+                          <asvg:svgBlip xmlns:asvg="http://schemas.microsoft.com/office/drawing/2016/SVG/main" r:embed="rId65"/>
+                        </a:ext>
+                      </a:extLst>
+                    </a:blip>
                     <a:stretch>
                       <a:fillRect/>
                     </a:stretch>
@@ -3462,7 +3472,7 @@
                   <pic:spPr bwMode="auto">
                     <a:xfrm>
                       <a:off x="0" y="0"/>
-                      <a:ext cx="5943600" cy="1385022"/>
+                      <a:ext cx="5943600" cy="1318398"/>
                     </a:xfrm>
                     <a:prstGeom prst="rect">
                       <a:avLst/>
@@ -3506,20 +3516,29 @@
       <w:r>
         <w:drawing>
           <wp:inline>
-            <wp:extent cx="5943600" cy="4400038"/>
+            <wp:extent cx="3810000" cy="2540000"/>
             <wp:effectExtent b="0" l="0" r="0" t="0"/>
             <wp:docPr descr="Mermaid Diagram 8" title="" id="70" name="Picture"/>
             <a:graphic>
               <a:graphicData uri="http://schemas.openxmlformats.org/drawingml/2006/picture">
                 <pic:pic>
                   <pic:nvPicPr>
-                    <pic:cNvPr descr="/var/folders/jb/21bs3_q12fj3w2_sz4tyt5nm0000gn/T/inkdown-mermaid-95fe5921-e9a6-48a1-bc6f-5af90f719a5d/mermaid-diagram-8.png" id="71" name="Picture"/>
+                    <pic:cNvPr descr="/var/folders/jb/21bs3_q12fj3w2_sz4tyt5nm0000gn/T/inkdown-mermaid-ac59f50d-191a-4958-97d7-d53e3139141c/mermaid-diagram-8.svg" id="71" name="Picture"/>
                     <pic:cNvPicPr>
                       <a:picLocks noChangeArrowheads="1" noChangeAspect="1"/>
                     </pic:cNvPicPr>
                   </pic:nvPicPr>
                   <pic:blipFill>
-                    <a:blip r:embed="rId69"/>
+                    <a:blip>
+                      <a:extLst>
+                        <a:ext uri="{28A0092B-C50C-407E-A947-70E740481C1C}">
+                          <a14:useLocalDpi xmlns:a14="http://schemas.microsoft.com/office/drawing/2010/main" val="0"/>
+                        </a:ext>
+                        <a:ext uri="{96DAC541-7B7A-43D3-8B79-37D633B846F1}">
+                          <asvg:svgBlip xmlns:asvg="http://schemas.microsoft.com/office/drawing/2016/SVG/main" r:embed="rId69"/>
+                        </a:ext>
+                      </a:extLst>
+                    </a:blip>
                     <a:stretch>
                       <a:fillRect/>
                     </a:stretch>
@@ -3527,7 +3546,7 @@
                   <pic:spPr bwMode="auto">
                     <a:xfrm>
                       <a:off x="0" y="0"/>
-                      <a:ext cx="5943600" cy="4400038"/>
+                      <a:ext cx="3810000" cy="2540000"/>
                     </a:xfrm>
                     <a:prstGeom prst="rect">
                       <a:avLst/>
@@ -3571,20 +3590,29 @@
       <w:r>
         <w:drawing>
           <wp:inline>
-            <wp:extent cx="5943600" cy="2333645"/>
+            <wp:extent cx="3810000" cy="2540000"/>
             <wp:effectExtent b="0" l="0" r="0" t="0"/>
             <wp:docPr descr="Mermaid Diagram 9" title="" id="74" name="Picture"/>
             <a:graphic>
               <a:graphicData uri="http://schemas.openxmlformats.org/drawingml/2006/picture">
                 <pic:pic>
                   <pic:nvPicPr>
-                    <pic:cNvPr descr="/var/folders/jb/21bs3_q12fj3w2_sz4tyt5nm0000gn/T/inkdown-mermaid-95fe5921-e9a6-48a1-bc6f-5af90f719a5d/mermaid-diagram-9.png" id="75" name="Picture"/>
+                    <pic:cNvPr descr="/var/folders/jb/21bs3_q12fj3w2_sz4tyt5nm0000gn/T/inkdown-mermaid-ac59f50d-191a-4958-97d7-d53e3139141c/mermaid-diagram-9.svg" id="75" name="Picture"/>
                     <pic:cNvPicPr>
                       <a:picLocks noChangeArrowheads="1" noChangeAspect="1"/>
                     </pic:cNvPicPr>
                   </pic:nvPicPr>
                   <pic:blipFill>
-                    <a:blip r:embed="rId73"/>
+                    <a:blip>
+                      <a:extLst>
+                        <a:ext uri="{28A0092B-C50C-407E-A947-70E740481C1C}">
+                          <a14:useLocalDpi xmlns:a14="http://schemas.microsoft.com/office/drawing/2010/main" val="0"/>
+                        </a:ext>
+                        <a:ext uri="{96DAC541-7B7A-43D3-8B79-37D633B846F1}">
+                          <asvg:svgBlip xmlns:asvg="http://schemas.microsoft.com/office/drawing/2016/SVG/main" r:embed="rId73"/>
+                        </a:ext>
+                      </a:extLst>
+                    </a:blip>
                     <a:stretch>
                       <a:fillRect/>
                     </a:stretch>
@@ -3592,7 +3620,7 @@
                   <pic:spPr bwMode="auto">
                     <a:xfrm>
                       <a:off x="0" y="0"/>
-                      <a:ext cx="5943600" cy="2333645"/>
+                      <a:ext cx="3810000" cy="2540000"/>
                     </a:xfrm>
                     <a:prstGeom prst="rect">
                       <a:avLst/>
@@ -3643,7 +3671,7 @@
               <a:graphicData uri="http://schemas.openxmlformats.org/drawingml/2006/picture">
                 <pic:pic>
                   <pic:nvPicPr>
-                    <pic:cNvPr descr="/var/folders/jb/21bs3_q12fj3w2_sz4tyt5nm0000gn/T/inkdown-mermaid-95fe5921-e9a6-48a1-bc6f-5af90f719a5d/mermaid-diagram-10.png" id="79" name="Picture"/>
+                    <pic:cNvPr descr="/var/folders/jb/21bs3_q12fj3w2_sz4tyt5nm0000gn/T/inkdown-mermaid-ac59f50d-191a-4958-97d7-d53e3139141c/mermaid-diagram-10.png" id="79" name="Picture"/>
                     <pic:cNvPicPr>
                       <a:picLocks noChangeArrowheads="1" noChangeAspect="1"/>
                     </pic:cNvPicPr>

</xml_diff>